<commit_message>
Renato Aragão: revisão parte 3
Co-Authored-By: Claude Opus 5.5 <noreply@anthropic.com>
Claude-Session: https://claude.ai/code/session_01MJjUEEZrxQDEUifKK2vj9g
</commit_message>
<xml_diff>
--- a/roteiros/renato-aragao/RenatoAragao_Parte3.docx
+++ b/roteiros/renato-aragao/RenatoAragao_Parte3.docx
@@ -103,7 +103,7 @@
         <w:rPr>
           <w:color w:val="000000"/>
         </w:rPr>
-        <w:t>Pouco depois, Renato começou um relacionamento com a fotógrafa Lílian Taranto, trinta e três anos mais nova. Em mil novecentos e noventa e nove, nasceu a filha dos dois, Lívian.</w:t>
+        <w:t>Anos depois, Renato começou um relacionamento com a fotógrafa Lílian Taranto, trinta e três anos mais nova. Em mil novecentos e noventa e nove, nasceu a filha dos dois, Lívian.</w:t>
       </w:r>
     </w:p>
     <w:p>
@@ -183,7 +183,7 @@
         <w:rPr>
           <w:color w:val="000000"/>
         </w:rPr>
-        <w:t>Naquele mesmo ano, em março de dois mil e catorze, o coração cobrou o preço. Renato sofreu um infarto e passou por uma angioplastia.</w:t>
+        <w:t>Naquele mesmo ano, em março de dois mil e catorze, o coração deu o primeiro grande susto. Renato sofreu um infarto e passou por uma angioplastia.</w:t>
       </w:r>
     </w:p>
     <w:p>
@@ -199,7 +199,7 @@
         <w:rPr>
           <w:color w:val="000000"/>
         </w:rPr>
-        <w:t>Naquela época, o Didi ainda falava sobre humor como quem dá lição. Numa entrevista à revista Playboy, em dois mil e quinze, criticou o grupo Porta dos Fundos por fazer piadas com religião. Disse que considerava aquilo agressivo e que esse tipo de humor machuca as pessoas.</w:t>
+        <w:t>Naquela época, o Didi também opinava sobre os limites do humor. Numa entrevista à revista Playboy, em dois mil e quinze, criticou o grupo Porta dos Fundos por fazer piadas com religião. Disse que considerava aquilo agressivo e que esse tipo de humor machuca as pessoas.</w:t>
       </w:r>
     </w:p>
     <w:p>
@@ -255,7 +255,7 @@
         <w:rPr>
           <w:color w:val="000000"/>
         </w:rPr>
-        <w:t>Era o mesmo homem que, na televisão, pedia amor ao próximo.</w:t>
+        <w:t>Era o mesmo homem que, durante vinte e seis anos, tinha pedido solidariedade na televisão.</w:t>
       </w:r>
     </w:p>
     <w:p>
@@ -304,14 +304,6 @@
           <w:color w:val="000000"/>
         </w:rPr>
         <w:t>Quarenta e quatro anos terminavam num post de rede social.</w:t>
-      </w:r>
-    </w:p>
-    <w:p>
-      <w:r>
-        <w:rPr>
-          <w:color w:val="000000"/>
-        </w:rPr>
-        <w:t>O homem que tinha sido o rosto dos domingos e do Criança Esperança saía da emissora sem festa de despedida.</w:t>
       </w:r>
     </w:p>
     <w:p>
@@ -383,7 +375,7 @@
         <w:rPr>
           <w:color w:val="C00000"/>
         </w:rPr>
-        <w:t>Spaca foi convidado para um podcast. E, no meio da conversa, contou uma história que não estava em nenhum dos sessenta e dois depoimentos do documentário. Uma história sobre a própria família do Didi. E sobre a filha que ninguém via.</w:t>
+        <w:t>Spaca foi convidado para um podcast. E, no meio da conversa, contou uma história que ia além dos bastidores dos Trapalhões. Uma história sobre a própria família do Didi. E sobre a filha que ninguém via.</w:t>
       </w:r>
     </w:p>
     <w:p>
@@ -455,7 +447,7 @@
         <w:rPr>
           <w:color w:val="1F4EB4"/>
         </w:rPr>
-        <w:t>Na segunda campanha, ela escreveu: "Sou motorista de Uber e há dois meses o ar-condicionado do meu carro quebrou. Estou trabalhando no calor e estou passando mal, pois sou asmática."</w:t>
+        <w:t>Numa das campanhas, ela escreveu: "Sou motorista de Uber e há dois meses o ar-condicionado do meu carro quebrou. Estou trabalhando no calor e estou passando mal, pois sou asmática."</w:t>
       </w:r>
     </w:p>
     <w:p>
@@ -487,7 +479,7 @@
         <w:rPr>
           <w:color w:val="1F4EB4"/>
         </w:rPr>
-        <w:t>Contou que Juliana tinha morado com o pai por mais de dez anos, até o começo de dois mil e vinte e cinco, quando decidiu sair de casa. Disse que a família não fazia ideia das vaquinhas. "Falei: como assim?"</w:t>
+        <w:t>Contou que Juliana tinha morado com o pai por mais de dez anos, até o começo de dois mil e vinte e cinco, quando decidiu sair de casa. Disse que a família não fazia ideia das vaquinhas e que ficou surpresa quando soube.</w:t>
       </w:r>
     </w:p>
     <w:p>

</xml_diff>